<commit_message>
feat(finalisation du rapport): fin du rapport fin du projet
</commit_message>
<xml_diff>
--- a/doc/Rapport Projet 320.docx
+++ b/doc/Rapport Projet 320.docx
@@ -12,9 +12,10 @@
           <w:color w:val="3A7C22" w:themeColor="accent6" w:themeShade="BF"/>
           <w:sz w:val="144"/>
           <w:szCs w:val="144"/>
-          <w:lang w:val="fr-FR"/>
-        </w:rPr>
-      </w:pPr>
+          <w:lang w:val="en-US"/>
+        </w:rPr>
+      </w:pPr>
+      <w:bookmarkStart w:id="0" w:name="_Toc224302945"/>
       <w:r>
         <w:rPr>
           <w:b/>
@@ -22,10 +23,11 @@
           <w:color w:val="3A7C22" w:themeColor="accent6" w:themeShade="BF"/>
           <w:sz w:val="144"/>
           <w:szCs w:val="144"/>
-          <w:lang w:val="fr-FR"/>
+          <w:lang w:val="en-US"/>
         </w:rPr>
         <w:t>BANCOMAT</w:t>
       </w:r>
+      <w:bookmarkEnd w:id="0"/>
     </w:p>
     <w:p>
       <w:pPr>
@@ -101,6 +103,7 @@
           <w:lang w:val="en-US"/>
         </w:rPr>
         <w:sectPr>
+          <w:footerReference w:type="default" r:id="rId8"/>
           <w:pgSz w:w="11906" w:h="16838" w:code="9"/>
           <w:pgMar w:top="1418" w:right="1418" w:bottom="1418" w:left="1418" w:header="709" w:footer="709" w:gutter="0"/>
           <w:cols w:space="708"/>
@@ -121,7 +124,13 @@
     <w:sdt>
       <w:sdtPr>
         <w:rPr>
-          <w:lang w:val="fr-FR"/>
+          <w:rFonts w:asciiTheme="minorHAnsi" w:eastAsiaTheme="minorHAnsi" w:hAnsiTheme="minorHAnsi" w:cstheme="minorBidi"/>
+          <w:color w:val="auto"/>
+          <w:kern w:val="2"/>
+          <w:sz w:val="24"/>
+          <w:szCs w:val="24"/>
+          <w:lang w:val="fr-FR" w:eastAsia="en-US"/>
+          <w14:ligatures w14:val="standardContextual"/>
         </w:rPr>
         <w:id w:val="-615602275"/>
         <w:docPartObj>
@@ -131,15 +140,9 @@
       </w:sdtPr>
       <w:sdtEndPr>
         <w:rPr>
-          <w:rFonts w:asciiTheme="minorHAnsi" w:eastAsiaTheme="minorHAnsi" w:hAnsiTheme="minorHAnsi" w:cstheme="minorBidi"/>
+          <w:rFonts w:ascii="Arial" w:hAnsi="Arial"/>
           <w:b/>
           <w:bCs/>
-          <w:color w:val="auto"/>
-          <w:kern w:val="2"/>
-          <w:sz w:val="24"/>
-          <w:szCs w:val="24"/>
-          <w:lang w:eastAsia="en-US"/>
-          <w14:ligatures w14:val="standardContextual"/>
         </w:rPr>
       </w:sdtEndPr>
       <w:sdtContent>
@@ -161,7 +164,7 @@
               <w:tab w:val="right" w:leader="dot" w:pos="9062"/>
             </w:tabs>
             <w:rPr>
-              <w:rFonts w:eastAsiaTheme="minorEastAsia"/>
+              <w:rFonts w:asciiTheme="minorHAnsi" w:eastAsiaTheme="minorEastAsia" w:hAnsiTheme="minorHAnsi"/>
               <w:noProof/>
               <w:lang w:eastAsia="fr-CH"/>
             </w:rPr>
@@ -175,14 +178,16 @@
           <w:r>
             <w:fldChar w:fldCharType="separate"/>
           </w:r>
-          <w:hyperlink w:anchor="_Toc222743718" w:history="1">
+          <w:hyperlink w:anchor="_Toc224302945" w:history="1">
             <w:r>
               <w:rPr>
                 <w:rStyle w:val="Lienhypertexte"/>
-                <w:noProof/>
-                <w:lang w:val="fr-FR"/>
-              </w:rPr>
-              <w:t>Rapport Projet 320</w:t>
+                <w:b/>
+                <w:bCs/>
+                <w:noProof/>
+                <w:lang w:val="en-US"/>
+              </w:rPr>
+              <w:t>BANCOMAT</w:t>
             </w:r>
             <w:r>
               <w:rPr>
@@ -203,7 +208,7 @@
                 <w:noProof/>
                 <w:webHidden/>
               </w:rPr>
-              <w:instrText xml:space="preserve"> PAGEREF _Toc222743718 \h </w:instrText>
+              <w:instrText xml:space="preserve"> PAGEREF _Toc224302945 \h </w:instrText>
             </w:r>
             <w:r>
               <w:rPr>
@@ -241,12 +246,12 @@
               <w:tab w:val="right" w:leader="dot" w:pos="9062"/>
             </w:tabs>
             <w:rPr>
-              <w:rFonts w:eastAsiaTheme="minorEastAsia"/>
+              <w:rFonts w:asciiTheme="minorHAnsi" w:eastAsiaTheme="minorEastAsia" w:hAnsiTheme="minorHAnsi"/>
               <w:noProof/>
               <w:lang w:eastAsia="fr-CH"/>
             </w:rPr>
           </w:pPr>
-          <w:hyperlink w:anchor="_Toc222743719" w:history="1">
+          <w:hyperlink w:anchor="_Toc224302946" w:history="1">
             <w:r>
               <w:rPr>
                 <w:rStyle w:val="Lienhypertexte"/>
@@ -274,7 +279,7 @@
                 <w:noProof/>
                 <w:webHidden/>
               </w:rPr>
-              <w:instrText xml:space="preserve"> PAGEREF _Toc222743719 \h </w:instrText>
+              <w:instrText xml:space="preserve"> PAGEREF _Toc224302946 \h </w:instrText>
             </w:r>
             <w:r>
               <w:rPr>
@@ -312,12 +317,12 @@
               <w:tab w:val="right" w:leader="dot" w:pos="9062"/>
             </w:tabs>
             <w:rPr>
-              <w:rFonts w:eastAsiaTheme="minorEastAsia"/>
+              <w:rFonts w:asciiTheme="minorHAnsi" w:eastAsiaTheme="minorEastAsia" w:hAnsiTheme="minorHAnsi"/>
               <w:noProof/>
               <w:lang w:eastAsia="fr-CH"/>
             </w:rPr>
           </w:pPr>
-          <w:hyperlink w:anchor="_Toc222743720" w:history="1">
+          <w:hyperlink w:anchor="_Toc224302947" w:history="1">
             <w:r>
               <w:rPr>
                 <w:rStyle w:val="Lienhypertexte"/>
@@ -345,7 +350,7 @@
                 <w:noProof/>
                 <w:webHidden/>
               </w:rPr>
-              <w:instrText xml:space="preserve"> PAGEREF _Toc222743720 \h </w:instrText>
+              <w:instrText xml:space="preserve"> PAGEREF _Toc224302947 \h </w:instrText>
             </w:r>
             <w:r>
               <w:rPr>
@@ -383,12 +388,12 @@
               <w:tab w:val="right" w:leader="dot" w:pos="9062"/>
             </w:tabs>
             <w:rPr>
-              <w:rFonts w:eastAsiaTheme="minorEastAsia"/>
+              <w:rFonts w:asciiTheme="minorHAnsi" w:eastAsiaTheme="minorEastAsia" w:hAnsiTheme="minorHAnsi"/>
               <w:noProof/>
               <w:lang w:eastAsia="fr-CH"/>
             </w:rPr>
           </w:pPr>
-          <w:hyperlink w:anchor="_Toc222743721" w:history="1">
+          <w:hyperlink w:anchor="_Toc224302948" w:history="1">
             <w:r>
               <w:rPr>
                 <w:rStyle w:val="Lienhypertexte"/>
@@ -416,7 +421,7 @@
                 <w:noProof/>
                 <w:webHidden/>
               </w:rPr>
-              <w:instrText xml:space="preserve"> PAGEREF _Toc222743721 \h </w:instrText>
+              <w:instrText xml:space="preserve"> PAGEREF _Toc224302948 \h </w:instrText>
             </w:r>
             <w:r>
               <w:rPr>
@@ -437,6 +442,432 @@
                 <w:webHidden/>
               </w:rPr>
               <w:t>3</w:t>
+            </w:r>
+            <w:r>
+              <w:rPr>
+                <w:noProof/>
+                <w:webHidden/>
+              </w:rPr>
+              <w:fldChar w:fldCharType="end"/>
+            </w:r>
+          </w:hyperlink>
+        </w:p>
+        <w:p>
+          <w:pPr>
+            <w:pStyle w:val="TM2"/>
+            <w:tabs>
+              <w:tab w:val="right" w:leader="dot" w:pos="9062"/>
+            </w:tabs>
+            <w:rPr>
+              <w:rFonts w:asciiTheme="minorHAnsi" w:eastAsiaTheme="minorEastAsia" w:hAnsiTheme="minorHAnsi"/>
+              <w:noProof/>
+              <w:lang w:eastAsia="fr-CH"/>
+            </w:rPr>
+          </w:pPr>
+          <w:hyperlink w:anchor="_Toc224302949" w:history="1">
+            <w:r>
+              <w:rPr>
+                <w:rStyle w:val="Lienhypertexte"/>
+                <w:noProof/>
+                <w:lang w:val="fr-FR"/>
+              </w:rPr>
+              <w:t>Analyse comparative entre les versions</w:t>
+            </w:r>
+            <w:r>
+              <w:rPr>
+                <w:noProof/>
+                <w:webHidden/>
+              </w:rPr>
+              <w:tab/>
+            </w:r>
+            <w:r>
+              <w:rPr>
+                <w:noProof/>
+                <w:webHidden/>
+              </w:rPr>
+              <w:fldChar w:fldCharType="begin"/>
+            </w:r>
+            <w:r>
+              <w:rPr>
+                <w:noProof/>
+                <w:webHidden/>
+              </w:rPr>
+              <w:instrText xml:space="preserve"> PAGEREF _Toc224302949 \h </w:instrText>
+            </w:r>
+            <w:r>
+              <w:rPr>
+                <w:noProof/>
+                <w:webHidden/>
+              </w:rPr>
+            </w:r>
+            <w:r>
+              <w:rPr>
+                <w:noProof/>
+                <w:webHidden/>
+              </w:rPr>
+              <w:fldChar w:fldCharType="separate"/>
+            </w:r>
+            <w:r>
+              <w:rPr>
+                <w:noProof/>
+                <w:webHidden/>
+              </w:rPr>
+              <w:t>3</w:t>
+            </w:r>
+            <w:r>
+              <w:rPr>
+                <w:noProof/>
+                <w:webHidden/>
+              </w:rPr>
+              <w:fldChar w:fldCharType="end"/>
+            </w:r>
+          </w:hyperlink>
+        </w:p>
+        <w:p>
+          <w:pPr>
+            <w:pStyle w:val="TM3"/>
+            <w:tabs>
+              <w:tab w:val="right" w:leader="dot" w:pos="9062"/>
+            </w:tabs>
+            <w:rPr>
+              <w:rFonts w:asciiTheme="minorHAnsi" w:eastAsiaTheme="minorEastAsia" w:hAnsiTheme="minorHAnsi"/>
+              <w:noProof/>
+              <w:lang w:eastAsia="fr-CH"/>
+            </w:rPr>
+          </w:pPr>
+          <w:hyperlink w:anchor="_Toc224302950" w:history="1">
+            <w:r>
+              <w:rPr>
+                <w:rStyle w:val="Lienhypertexte"/>
+                <w:noProof/>
+                <w:lang w:val="fr-FR"/>
+              </w:rPr>
+              <w:t>Version 1 – Approche procédurale</w:t>
+            </w:r>
+            <w:r>
+              <w:rPr>
+                <w:noProof/>
+                <w:webHidden/>
+              </w:rPr>
+              <w:tab/>
+            </w:r>
+            <w:r>
+              <w:rPr>
+                <w:noProof/>
+                <w:webHidden/>
+              </w:rPr>
+              <w:fldChar w:fldCharType="begin"/>
+            </w:r>
+            <w:r>
+              <w:rPr>
+                <w:noProof/>
+                <w:webHidden/>
+              </w:rPr>
+              <w:instrText xml:space="preserve"> PAGEREF _Toc224302950 \h </w:instrText>
+            </w:r>
+            <w:r>
+              <w:rPr>
+                <w:noProof/>
+                <w:webHidden/>
+              </w:rPr>
+            </w:r>
+            <w:r>
+              <w:rPr>
+                <w:noProof/>
+                <w:webHidden/>
+              </w:rPr>
+              <w:fldChar w:fldCharType="separate"/>
+            </w:r>
+            <w:r>
+              <w:rPr>
+                <w:noProof/>
+                <w:webHidden/>
+              </w:rPr>
+              <w:t>3</w:t>
+            </w:r>
+            <w:r>
+              <w:rPr>
+                <w:noProof/>
+                <w:webHidden/>
+              </w:rPr>
+              <w:fldChar w:fldCharType="end"/>
+            </w:r>
+          </w:hyperlink>
+        </w:p>
+        <w:p>
+          <w:pPr>
+            <w:pStyle w:val="TM3"/>
+            <w:tabs>
+              <w:tab w:val="right" w:leader="dot" w:pos="9062"/>
+            </w:tabs>
+            <w:rPr>
+              <w:rFonts w:asciiTheme="minorHAnsi" w:eastAsiaTheme="minorEastAsia" w:hAnsiTheme="minorHAnsi"/>
+              <w:noProof/>
+              <w:lang w:eastAsia="fr-CH"/>
+            </w:rPr>
+          </w:pPr>
+          <w:hyperlink w:anchor="_Toc224302951" w:history="1">
+            <w:r>
+              <w:rPr>
+                <w:rStyle w:val="Lienhypertexte"/>
+                <w:noProof/>
+                <w:lang w:val="fr-FR"/>
+              </w:rPr>
+              <w:t>Version 2 – Classes statiques et modularité</w:t>
+            </w:r>
+            <w:r>
+              <w:rPr>
+                <w:noProof/>
+                <w:webHidden/>
+              </w:rPr>
+              <w:tab/>
+            </w:r>
+            <w:r>
+              <w:rPr>
+                <w:noProof/>
+                <w:webHidden/>
+              </w:rPr>
+              <w:fldChar w:fldCharType="begin"/>
+            </w:r>
+            <w:r>
+              <w:rPr>
+                <w:noProof/>
+                <w:webHidden/>
+              </w:rPr>
+              <w:instrText xml:space="preserve"> PAGEREF _Toc224302951 \h </w:instrText>
+            </w:r>
+            <w:r>
+              <w:rPr>
+                <w:noProof/>
+                <w:webHidden/>
+              </w:rPr>
+            </w:r>
+            <w:r>
+              <w:rPr>
+                <w:noProof/>
+                <w:webHidden/>
+              </w:rPr>
+              <w:fldChar w:fldCharType="separate"/>
+            </w:r>
+            <w:r>
+              <w:rPr>
+                <w:noProof/>
+                <w:webHidden/>
+              </w:rPr>
+              <w:t>4</w:t>
+            </w:r>
+            <w:r>
+              <w:rPr>
+                <w:noProof/>
+                <w:webHidden/>
+              </w:rPr>
+              <w:fldChar w:fldCharType="end"/>
+            </w:r>
+          </w:hyperlink>
+        </w:p>
+        <w:p>
+          <w:pPr>
+            <w:pStyle w:val="TM3"/>
+            <w:tabs>
+              <w:tab w:val="right" w:leader="dot" w:pos="9062"/>
+            </w:tabs>
+            <w:rPr>
+              <w:rFonts w:asciiTheme="minorHAnsi" w:eastAsiaTheme="minorEastAsia" w:hAnsiTheme="minorHAnsi"/>
+              <w:noProof/>
+              <w:lang w:eastAsia="fr-CH"/>
+            </w:rPr>
+          </w:pPr>
+          <w:hyperlink w:anchor="_Toc224302952" w:history="1">
+            <w:r>
+              <w:rPr>
+                <w:rStyle w:val="Lienhypertexte"/>
+                <w:noProof/>
+                <w:lang w:val="fr-FR"/>
+              </w:rPr>
+              <w:t>Version 3 – Programmation orientée objet complète</w:t>
+            </w:r>
+            <w:r>
+              <w:rPr>
+                <w:noProof/>
+                <w:webHidden/>
+              </w:rPr>
+              <w:tab/>
+            </w:r>
+            <w:r>
+              <w:rPr>
+                <w:noProof/>
+                <w:webHidden/>
+              </w:rPr>
+              <w:fldChar w:fldCharType="begin"/>
+            </w:r>
+            <w:r>
+              <w:rPr>
+                <w:noProof/>
+                <w:webHidden/>
+              </w:rPr>
+              <w:instrText xml:space="preserve"> PAGEREF _Toc224302952 \h </w:instrText>
+            </w:r>
+            <w:r>
+              <w:rPr>
+                <w:noProof/>
+                <w:webHidden/>
+              </w:rPr>
+            </w:r>
+            <w:r>
+              <w:rPr>
+                <w:noProof/>
+                <w:webHidden/>
+              </w:rPr>
+              <w:fldChar w:fldCharType="separate"/>
+            </w:r>
+            <w:r>
+              <w:rPr>
+                <w:noProof/>
+                <w:webHidden/>
+              </w:rPr>
+              <w:t>4</w:t>
+            </w:r>
+            <w:r>
+              <w:rPr>
+                <w:noProof/>
+                <w:webHidden/>
+              </w:rPr>
+              <w:fldChar w:fldCharType="end"/>
+            </w:r>
+          </w:hyperlink>
+        </w:p>
+        <w:p>
+          <w:pPr>
+            <w:pStyle w:val="TM3"/>
+            <w:tabs>
+              <w:tab w:val="right" w:leader="dot" w:pos="9062"/>
+            </w:tabs>
+            <w:rPr>
+              <w:rFonts w:asciiTheme="minorHAnsi" w:eastAsiaTheme="minorEastAsia" w:hAnsiTheme="minorHAnsi"/>
+              <w:noProof/>
+              <w:lang w:eastAsia="fr-CH"/>
+            </w:rPr>
+          </w:pPr>
+          <w:hyperlink w:anchor="_Toc224302953" w:history="1">
+            <w:r>
+              <w:rPr>
+                <w:rStyle w:val="Lienhypertexte"/>
+                <w:noProof/>
+                <w:lang w:val="fr-FR"/>
+              </w:rPr>
+              <w:t>Réflexion sur l’évolution de la conception</w:t>
+            </w:r>
+            <w:r>
+              <w:rPr>
+                <w:noProof/>
+                <w:webHidden/>
+              </w:rPr>
+              <w:tab/>
+            </w:r>
+            <w:r>
+              <w:rPr>
+                <w:noProof/>
+                <w:webHidden/>
+              </w:rPr>
+              <w:fldChar w:fldCharType="begin"/>
+            </w:r>
+            <w:r>
+              <w:rPr>
+                <w:noProof/>
+                <w:webHidden/>
+              </w:rPr>
+              <w:instrText xml:space="preserve"> PAGEREF _Toc224302953 \h </w:instrText>
+            </w:r>
+            <w:r>
+              <w:rPr>
+                <w:noProof/>
+                <w:webHidden/>
+              </w:rPr>
+            </w:r>
+            <w:r>
+              <w:rPr>
+                <w:noProof/>
+                <w:webHidden/>
+              </w:rPr>
+              <w:fldChar w:fldCharType="separate"/>
+            </w:r>
+            <w:r>
+              <w:rPr>
+                <w:noProof/>
+                <w:webHidden/>
+              </w:rPr>
+              <w:t>4</w:t>
+            </w:r>
+            <w:r>
+              <w:rPr>
+                <w:noProof/>
+                <w:webHidden/>
+              </w:rPr>
+              <w:fldChar w:fldCharType="end"/>
+            </w:r>
+          </w:hyperlink>
+        </w:p>
+        <w:p>
+          <w:pPr>
+            <w:pStyle w:val="TM2"/>
+            <w:tabs>
+              <w:tab w:val="right" w:leader="dot" w:pos="9062"/>
+            </w:tabs>
+            <w:rPr>
+              <w:rFonts w:asciiTheme="minorHAnsi" w:eastAsiaTheme="minorEastAsia" w:hAnsiTheme="minorHAnsi"/>
+              <w:noProof/>
+              <w:lang w:eastAsia="fr-CH"/>
+            </w:rPr>
+          </w:pPr>
+          <w:hyperlink w:anchor="_Toc224302954" w:history="1">
+            <w:r>
+              <w:rPr>
+                <w:rStyle w:val="Lienhypertexte"/>
+                <w:noProof/>
+                <w:lang w:val="fr-FR"/>
+              </w:rPr>
+              <w:t>Conclusion</w:t>
+            </w:r>
+            <w:r>
+              <w:rPr>
+                <w:noProof/>
+                <w:webHidden/>
+              </w:rPr>
+              <w:tab/>
+            </w:r>
+            <w:r>
+              <w:rPr>
+                <w:noProof/>
+                <w:webHidden/>
+              </w:rPr>
+              <w:fldChar w:fldCharType="begin"/>
+            </w:r>
+            <w:r>
+              <w:rPr>
+                <w:noProof/>
+                <w:webHidden/>
+              </w:rPr>
+              <w:instrText xml:space="preserve"> PAGEREF _Toc224302954 \h </w:instrText>
+            </w:r>
+            <w:r>
+              <w:rPr>
+                <w:noProof/>
+                <w:webHidden/>
+              </w:rPr>
+            </w:r>
+            <w:r>
+              <w:rPr>
+                <w:noProof/>
+                <w:webHidden/>
+              </w:rPr>
+              <w:fldChar w:fldCharType="separate"/>
+            </w:r>
+            <w:r>
+              <w:rPr>
+                <w:noProof/>
+                <w:webHidden/>
+              </w:rPr>
+              <w:t>5</w:t>
             </w:r>
             <w:r>
               <w:rPr>
@@ -488,14 +919,14 @@
           <w:lang w:val="fr-FR"/>
         </w:rPr>
       </w:pPr>
-      <w:bookmarkStart w:id="0" w:name="_Toc222743719"/>
+      <w:bookmarkStart w:id="1" w:name="_Toc224302946"/>
       <w:r>
         <w:rPr>
           <w:lang w:val="fr-FR"/>
         </w:rPr>
         <w:t>Introduction</w:t>
       </w:r>
-      <w:bookmarkEnd w:id="0"/>
+      <w:bookmarkEnd w:id="1"/>
     </w:p>
     <w:p>
       <w:pPr>
@@ -504,14 +935,14 @@
           <w:lang w:val="fr-FR"/>
         </w:rPr>
       </w:pPr>
-      <w:bookmarkStart w:id="1" w:name="_Toc222743720"/>
+      <w:bookmarkStart w:id="2" w:name="_Toc224302947"/>
       <w:r>
         <w:rPr>
           <w:lang w:val="fr-FR"/>
         </w:rPr>
         <w:t>Objectif</w:t>
       </w:r>
-      <w:bookmarkEnd w:id="1"/>
+      <w:bookmarkEnd w:id="2"/>
     </w:p>
     <w:p>
       <w:r>
@@ -570,14 +1001,14 @@
           <w:lang w:val="fr-FR"/>
         </w:rPr>
       </w:pPr>
-      <w:bookmarkStart w:id="2" w:name="_Toc222743721"/>
+      <w:bookmarkStart w:id="3" w:name="_Toc224302948"/>
       <w:r>
         <w:rPr>
           <w:lang w:val="fr-FR"/>
         </w:rPr>
         <w:t>Choix du domaine</w:t>
       </w:r>
-      <w:bookmarkEnd w:id="2"/>
+      <w:bookmarkEnd w:id="3"/>
     </w:p>
     <w:p>
       <w:pPr>
@@ -603,6 +1034,778 @@
         </w:rPr>
         <w:t xml:space="preserve"> car c’est celui qui m’intéresse le plus.</w:t>
       </w:r>
+    </w:p>
+    <w:p>
+      <w:pPr>
+        <w:pStyle w:val="Titre2"/>
+        <w:rPr>
+          <w:lang w:val="fr-FR"/>
+        </w:rPr>
+      </w:pPr>
+      <w:bookmarkStart w:id="4" w:name="_Toc_Analyse"/>
+      <w:bookmarkStart w:id="5" w:name="_Toc224302949"/>
+      <w:r>
+        <w:rPr>
+          <w:lang w:val="fr-FR"/>
+        </w:rPr>
+        <w:t>Analyse comparative entre les versions</w:t>
+      </w:r>
+      <w:bookmarkEnd w:id="4"/>
+      <w:bookmarkEnd w:id="5"/>
+    </w:p>
+    <w:p>
+      <w:pPr>
+        <w:rPr>
+          <w:lang w:val="fr-FR"/>
+        </w:rPr>
+      </w:pPr>
+      <w:r>
+        <w:rPr>
+          <w:lang w:val="fr-FR"/>
+        </w:rPr>
+        <w:t>Les trois versions de ce projet représentent une progression pédagogique logique, chacune apportant un niveau d’abstraction supplémentaire par rapport à la précédente. Cette section analyse les avantages et inconvénients de chaque approche, ainsi que l’évolution de la conception tout au long du projet.</w:t>
+      </w:r>
+    </w:p>
+    <w:p>
+      <w:pPr>
+        <w:pStyle w:val="Titre3"/>
+        <w:rPr>
+          <w:lang w:val="fr-FR"/>
+        </w:rPr>
+      </w:pPr>
+      <w:bookmarkStart w:id="6" w:name="_Toc224302950"/>
+      <w:r>
+        <w:rPr>
+          <w:lang w:val="fr-FR"/>
+        </w:rPr>
+        <w:t>Version 1 – Approche procédurale</w:t>
+      </w:r>
+      <w:bookmarkEnd w:id="6"/>
+    </w:p>
+    <w:p>
+      <w:pPr>
+        <w:rPr>
+          <w:b/>
+          <w:lang w:val="fr-FR"/>
+        </w:rPr>
+      </w:pPr>
+      <w:r>
+        <w:rPr>
+          <w:b/>
+          <w:lang w:val="fr-FR"/>
+        </w:rPr>
+        <w:t>Avantages :</w:t>
+      </w:r>
+    </w:p>
+    <w:p>
+      <w:pPr>
+        <w:pStyle w:val="Paragraphedeliste"/>
+        <w:numPr>
+          <w:ilvl w:val="0"/>
+          <w:numId w:val="3"/>
+        </w:numPr>
+      </w:pPr>
+      <w:r>
+        <w:t>Simple à comprendre et à mettre en place, idéale pour poser les bases de la logique de l’application.</w:t>
+      </w:r>
+    </w:p>
+    <w:p>
+      <w:pPr>
+        <w:pStyle w:val="Paragraphedeliste"/>
+        <w:numPr>
+          <w:ilvl w:val="0"/>
+          <w:numId w:val="3"/>
+        </w:numPr>
+      </w:pPr>
+      <w:r>
+        <w:t>Permet de se concentrer uniquement sur les algorithmes (vérification du code PIN, calcul du solde, impression du reçu) sans se soucier de l’architecture.</w:t>
+      </w:r>
+    </w:p>
+    <w:p>
+      <w:pPr>
+        <w:pStyle w:val="Paragraphedeliste"/>
+        <w:numPr>
+          <w:ilvl w:val="0"/>
+          <w:numId w:val="3"/>
+        </w:numPr>
+      </w:pPr>
+      <w:r>
+        <w:t>Rapide à exécuter : toutes les fonctions (</w:t>
+      </w:r>
+      <w:proofErr w:type="spellStart"/>
+      <w:r>
+        <w:t>VerifierCode</w:t>
+      </w:r>
+      <w:proofErr w:type="spellEnd"/>
+      <w:r>
+        <w:t xml:space="preserve">, </w:t>
+      </w:r>
+      <w:proofErr w:type="spellStart"/>
+      <w:r>
+        <w:t>RetirerArgent</w:t>
+      </w:r>
+      <w:proofErr w:type="spellEnd"/>
+      <w:r>
+        <w:t xml:space="preserve">, </w:t>
+      </w:r>
+      <w:proofErr w:type="spellStart"/>
+      <w:r>
+        <w:t>ConsulterSolde</w:t>
+      </w:r>
+      <w:proofErr w:type="spellEnd"/>
+      <w:r>
+        <w:t xml:space="preserve">) sont accessibles directement dans </w:t>
+      </w:r>
+      <w:proofErr w:type="spellStart"/>
+      <w:r>
+        <w:t>Program.cs</w:t>
+      </w:r>
+      <w:proofErr w:type="spellEnd"/>
+      <w:r>
+        <w:t>.</w:t>
+      </w:r>
+    </w:p>
+    <w:p>
+      <w:pPr>
+        <w:rPr>
+          <w:b/>
+          <w:lang w:val="fr-FR"/>
+        </w:rPr>
+      </w:pPr>
+      <w:r>
+        <w:rPr>
+          <w:b/>
+          <w:lang w:val="fr-FR"/>
+        </w:rPr>
+        <w:t>Inconvénients :</w:t>
+      </w:r>
+    </w:p>
+    <w:p>
+      <w:pPr>
+        <w:pStyle w:val="Paragraphedeliste"/>
+        <w:numPr>
+          <w:ilvl w:val="0"/>
+          <w:numId w:val="3"/>
+        </w:numPr>
+      </w:pPr>
+      <w:r>
+        <w:t xml:space="preserve">Le fichier </w:t>
+      </w:r>
+      <w:proofErr w:type="spellStart"/>
+      <w:r>
+        <w:t>Program.cs</w:t>
+      </w:r>
+      <w:proofErr w:type="spellEnd"/>
+      <w:r>
+        <w:t xml:space="preserve"> devient rapidement très long et difficile à maintenir lorsque le nombre de fonctionnalités augmente.</w:t>
+      </w:r>
+    </w:p>
+    <w:p>
+      <w:pPr>
+        <w:pStyle w:val="Paragraphedeliste"/>
+        <w:numPr>
+          <w:ilvl w:val="0"/>
+          <w:numId w:val="3"/>
+        </w:numPr>
+      </w:pPr>
+      <w:r>
+        <w:t>Absence de séparation des responsabilités : la logique métier, l’affichage et la gestion des entrées sont mélangés.</w:t>
+      </w:r>
+    </w:p>
+    <w:p>
+      <w:pPr>
+        <w:pStyle w:val="Paragraphedeliste"/>
+        <w:numPr>
+          <w:ilvl w:val="0"/>
+          <w:numId w:val="3"/>
+        </w:numPr>
+      </w:pPr>
+      <w:r>
+        <w:t>Le code n’est pas réutilisable : une modification dans une fonction peut avoir des effets indésirables sur l’ensemble du programme.</w:t>
+      </w:r>
+    </w:p>
+    <w:p>
+      <w:pPr>
+        <w:pStyle w:val="Titre3"/>
+        <w:rPr>
+          <w:lang w:val="fr-FR"/>
+        </w:rPr>
+      </w:pPr>
+      <w:bookmarkStart w:id="7" w:name="_Toc224302951"/>
+      <w:r>
+        <w:rPr>
+          <w:lang w:val="fr-FR"/>
+        </w:rPr>
+        <w:lastRenderedPageBreak/>
+        <w:t>Version 2 – Classes statiques et modularité</w:t>
+      </w:r>
+      <w:bookmarkEnd w:id="7"/>
+    </w:p>
+    <w:p>
+      <w:pPr>
+        <w:rPr>
+          <w:b/>
+          <w:lang w:val="fr-FR"/>
+        </w:rPr>
+      </w:pPr>
+      <w:r>
+        <w:rPr>
+          <w:b/>
+          <w:lang w:val="fr-FR"/>
+        </w:rPr>
+        <w:t>Avantages :</w:t>
+      </w:r>
+    </w:p>
+    <w:p>
+      <w:pPr>
+        <w:pStyle w:val="Paragraphedeliste"/>
+        <w:numPr>
+          <w:ilvl w:val="0"/>
+          <w:numId w:val="3"/>
+        </w:numPr>
+      </w:pPr>
+      <w:r>
+        <w:t>Le code est organisé en classes spécialisées (</w:t>
+      </w:r>
+      <w:proofErr w:type="spellStart"/>
+      <w:r>
+        <w:t>AuthenticationManager</w:t>
+      </w:r>
+      <w:proofErr w:type="spellEnd"/>
+      <w:r>
+        <w:t xml:space="preserve">, </w:t>
+      </w:r>
+      <w:proofErr w:type="spellStart"/>
+      <w:r>
+        <w:t>TransactionProcessor</w:t>
+      </w:r>
+      <w:proofErr w:type="spellEnd"/>
+      <w:r>
+        <w:t>) ce qui facilite la lecture et la navigation.</w:t>
+      </w:r>
+    </w:p>
+    <w:p>
+      <w:pPr>
+        <w:pStyle w:val="Paragraphedeliste"/>
+        <w:numPr>
+          <w:ilvl w:val="0"/>
+          <w:numId w:val="3"/>
+        </w:numPr>
+      </w:pPr>
+      <w:r>
+        <w:t xml:space="preserve">La séparation des responsabilités est claire : chaque classe </w:t>
+      </w:r>
+      <w:proofErr w:type="gramStart"/>
+      <w:r>
+        <w:t>a</w:t>
+      </w:r>
+      <w:proofErr w:type="gramEnd"/>
+      <w:r>
+        <w:t xml:space="preserve"> un rôle précis, ce qui réduit les dépendances et facilite les modifications.</w:t>
+      </w:r>
+    </w:p>
+    <w:p>
+      <w:pPr>
+        <w:pStyle w:val="Paragraphedeliste"/>
+        <w:numPr>
+          <w:ilvl w:val="0"/>
+          <w:numId w:val="3"/>
+        </w:numPr>
+      </w:pPr>
+      <w:r>
+        <w:t xml:space="preserve">L’utilisation de </w:t>
+      </w:r>
+      <w:proofErr w:type="spellStart"/>
+      <w:r>
+        <w:t>namespaces</w:t>
+      </w:r>
+      <w:proofErr w:type="spellEnd"/>
+      <w:r>
+        <w:t xml:space="preserve"> logiques améliore l’organisation générale du projet et évite les conflits de noms.</w:t>
+      </w:r>
+    </w:p>
+    <w:p>
+      <w:pPr>
+        <w:rPr>
+          <w:b/>
+          <w:lang w:val="fr-FR"/>
+        </w:rPr>
+      </w:pPr>
+      <w:r>
+        <w:rPr>
+          <w:b/>
+          <w:lang w:val="fr-FR"/>
+        </w:rPr>
+        <w:t>Inconvénients :</w:t>
+      </w:r>
+    </w:p>
+    <w:p>
+      <w:pPr>
+        <w:pStyle w:val="Paragraphedeliste"/>
+        <w:numPr>
+          <w:ilvl w:val="0"/>
+          <w:numId w:val="3"/>
+        </w:numPr>
+      </w:pPr>
+      <w:r>
+        <w:t>Les classes statiques ne peuvent pas être instanciées, ce qui empêche la création de plusieurs comptes ou transactions simultanées.</w:t>
+      </w:r>
+    </w:p>
+    <w:p>
+      <w:pPr>
+        <w:pStyle w:val="Paragraphedeliste"/>
+        <w:numPr>
+          <w:ilvl w:val="0"/>
+          <w:numId w:val="3"/>
+        </w:numPr>
+      </w:pPr>
+      <w:r>
+        <w:t>L’héritage et le polymorphisme ne sont pas exploitables, ce qui limite l’extensibilité du code pour de futures évolutions.</w:t>
+      </w:r>
+    </w:p>
+    <w:p>
+      <w:pPr>
+        <w:pStyle w:val="Titre3"/>
+        <w:rPr>
+          <w:lang w:val="fr-FR"/>
+        </w:rPr>
+      </w:pPr>
+      <w:bookmarkStart w:id="8" w:name="_Toc224302952"/>
+      <w:r>
+        <w:rPr>
+          <w:lang w:val="fr-FR"/>
+        </w:rPr>
+        <w:t>Version 3 – Programmation orientée objet complète</w:t>
+      </w:r>
+      <w:bookmarkEnd w:id="8"/>
+    </w:p>
+    <w:p>
+      <w:pPr>
+        <w:rPr>
+          <w:b/>
+          <w:lang w:val="fr-FR"/>
+        </w:rPr>
+      </w:pPr>
+      <w:r>
+        <w:rPr>
+          <w:b/>
+          <w:lang w:val="fr-FR"/>
+        </w:rPr>
+        <w:t>Avantages :</w:t>
+      </w:r>
+    </w:p>
+    <w:p>
+      <w:pPr>
+        <w:pStyle w:val="Paragraphedeliste"/>
+        <w:numPr>
+          <w:ilvl w:val="0"/>
+          <w:numId w:val="3"/>
+        </w:numPr>
+      </w:pPr>
+      <w:r>
+        <w:t xml:space="preserve">Les entités sont représentées par des classes dédiées : </w:t>
+      </w:r>
+      <w:proofErr w:type="spellStart"/>
+      <w:r>
+        <w:t>AuthentificationManager</w:t>
+      </w:r>
+      <w:proofErr w:type="spellEnd"/>
+      <w:r>
+        <w:t xml:space="preserve"> gère la carte et le PIN, </w:t>
+      </w:r>
+      <w:proofErr w:type="spellStart"/>
+      <w:r>
+        <w:t>ClassicTransaction</w:t>
+      </w:r>
+      <w:proofErr w:type="spellEnd"/>
+      <w:r>
+        <w:t xml:space="preserve"> et </w:t>
+      </w:r>
+      <w:proofErr w:type="spellStart"/>
+      <w:r>
+        <w:t>TransactionVIP</w:t>
+      </w:r>
+      <w:proofErr w:type="spellEnd"/>
+      <w:r>
+        <w:t xml:space="preserve"> gèrent les opérations bancaires, et Menu </w:t>
+      </w:r>
+      <w:r>
+        <w:t>pour la</w:t>
+      </w:r>
+      <w:r>
+        <w:t xml:space="preserve"> navigation. Chaque classe </w:t>
+      </w:r>
+      <w:r>
+        <w:t>joue</w:t>
+      </w:r>
+      <w:r>
+        <w:t xml:space="preserve"> un rôle clair et précis.</w:t>
+      </w:r>
+    </w:p>
+    <w:p>
+      <w:pPr>
+        <w:pStyle w:val="Paragraphedeliste"/>
+        <w:numPr>
+          <w:ilvl w:val="0"/>
+          <w:numId w:val="3"/>
+        </w:numPr>
+      </w:pPr>
+      <w:r>
+        <w:t>L’encapsulation protège les données sensibles : le solde (cash), le numéro de carte (</w:t>
+      </w:r>
+      <w:proofErr w:type="spellStart"/>
+      <w:r>
+        <w:t>cardNumber</w:t>
+      </w:r>
+      <w:proofErr w:type="spellEnd"/>
+      <w:r>
+        <w:t>) et le code PIN (</w:t>
+      </w:r>
+      <w:proofErr w:type="spellStart"/>
+      <w:r>
+        <w:t>pinCode</w:t>
+      </w:r>
+      <w:proofErr w:type="spellEnd"/>
+      <w:r>
+        <w:t>) sont des champs privés ou protégés, accessibles uniquement via des propriétés et méthodes publiques contrôlées.</w:t>
+      </w:r>
+    </w:p>
+    <w:p>
+      <w:pPr>
+        <w:pStyle w:val="Paragraphedeliste"/>
+        <w:numPr>
+          <w:ilvl w:val="0"/>
+          <w:numId w:val="3"/>
+        </w:numPr>
+      </w:pPr>
+      <w:r>
+        <w:t xml:space="preserve">L’héritage est concrètement appliqué : </w:t>
+      </w:r>
+      <w:proofErr w:type="spellStart"/>
+      <w:r>
+        <w:t>TransactionVIP</w:t>
+      </w:r>
+      <w:proofErr w:type="spellEnd"/>
+      <w:r>
+        <w:t xml:space="preserve"> hérite de </w:t>
+      </w:r>
+      <w:proofErr w:type="spellStart"/>
+      <w:r>
+        <w:t>ClassicTransaction</w:t>
+      </w:r>
+      <w:proofErr w:type="spellEnd"/>
+      <w:r>
+        <w:t xml:space="preserve"> et surcharge la méthode </w:t>
+      </w:r>
+      <w:proofErr w:type="spellStart"/>
+      <w:proofErr w:type="gramStart"/>
+      <w:r>
+        <w:t>withDraw</w:t>
+      </w:r>
+      <w:proofErr w:type="spellEnd"/>
+      <w:r>
+        <w:t>(</w:t>
+      </w:r>
+      <w:proofErr w:type="gramEnd"/>
+      <w:r>
+        <w:t xml:space="preserve">) (mot-clé </w:t>
+      </w:r>
+      <w:proofErr w:type="spellStart"/>
+      <w:r>
+        <w:t>override</w:t>
+      </w:r>
+      <w:proofErr w:type="spellEnd"/>
+      <w:r>
+        <w:t xml:space="preserve">) pour offrir un retrait sans vérification de solde. Le polymorphisme est utilisé via la propriété Processor dans Menu, qui reçoit soit un </w:t>
+      </w:r>
+      <w:proofErr w:type="spellStart"/>
+      <w:r>
+        <w:t>ClassicTransaction</w:t>
+      </w:r>
+      <w:proofErr w:type="spellEnd"/>
+      <w:r>
+        <w:t xml:space="preserve">, soit un </w:t>
+      </w:r>
+      <w:proofErr w:type="spellStart"/>
+      <w:r>
+        <w:t>TransactionVIP</w:t>
+      </w:r>
+      <w:proofErr w:type="spellEnd"/>
+      <w:r>
+        <w:t xml:space="preserve"> selon le numéro de carte.</w:t>
+      </w:r>
+    </w:p>
+    <w:p>
+      <w:pPr>
+        <w:rPr>
+          <w:b/>
+          <w:lang w:val="fr-FR"/>
+        </w:rPr>
+      </w:pPr>
+      <w:r>
+        <w:rPr>
+          <w:b/>
+          <w:lang w:val="fr-FR"/>
+        </w:rPr>
+        <w:t>Inconvénients :</w:t>
+      </w:r>
+    </w:p>
+    <w:p>
+      <w:pPr>
+        <w:pStyle w:val="Paragraphedeliste"/>
+        <w:numPr>
+          <w:ilvl w:val="0"/>
+          <w:numId w:val="3"/>
+        </w:numPr>
+      </w:pPr>
+      <w:r>
+        <w:t>La conception demandée est plus complexe et nécessite une réflexion préalable sur la hiérarchie des classes avant de commencer à coder.</w:t>
+      </w:r>
+    </w:p>
+    <w:p>
+      <w:pPr>
+        <w:pStyle w:val="Paragraphedeliste"/>
+        <w:numPr>
+          <w:ilvl w:val="0"/>
+          <w:numId w:val="3"/>
+        </w:numPr>
+      </w:pPr>
+      <w:r>
+        <w:t>Le volume de code est plus important par rapport aux versions précédentes, ce qui allonge le temps de développement initial.</w:t>
+      </w:r>
+    </w:p>
+    <w:p>
+      <w:pPr>
+        <w:pStyle w:val="Titre3"/>
+        <w:rPr>
+          <w:lang w:val="fr-FR"/>
+        </w:rPr>
+      </w:pPr>
+      <w:bookmarkStart w:id="9" w:name="_Toc224302953"/>
+      <w:r>
+        <w:rPr>
+          <w:lang w:val="fr-FR"/>
+        </w:rPr>
+        <w:t>Réflexion sur l’évolution de la conception</w:t>
+      </w:r>
+      <w:bookmarkEnd w:id="9"/>
+    </w:p>
+    <w:p>
+      <w:pPr>
+        <w:rPr>
+          <w:lang w:val="fr-FR"/>
+        </w:rPr>
+      </w:pPr>
+      <w:r>
+        <w:rPr>
+          <w:lang w:val="fr-FR"/>
+        </w:rPr>
+        <w:t xml:space="preserve">La progression entre les trois versions </w:t>
+      </w:r>
+      <w:r>
+        <w:rPr>
+          <w:lang w:val="fr-FR"/>
+        </w:rPr>
+        <w:t>nous aide énormément à comprendre et maitriser</w:t>
+      </w:r>
+      <w:r>
+        <w:rPr>
+          <w:lang w:val="fr-FR"/>
+        </w:rPr>
+        <w:t xml:space="preserve"> la programmation orientée objet. En version 1, toute la logique du bancomat était concentrée dans </w:t>
+      </w:r>
+      <w:proofErr w:type="spellStart"/>
+      <w:r>
+        <w:rPr>
+          <w:lang w:val="fr-FR"/>
+        </w:rPr>
+        <w:t>Program.cs</w:t>
+      </w:r>
+      <w:proofErr w:type="spellEnd"/>
+      <w:r>
+        <w:rPr>
+          <w:lang w:val="fr-FR"/>
+        </w:rPr>
+        <w:t xml:space="preserve"> avec des fonctions globales. Le passage à la version 2 a permis d’organiser ce code en classes statiques spécialisées sans </w:t>
+      </w:r>
+      <w:r>
+        <w:rPr>
+          <w:lang w:val="fr-FR"/>
+        </w:rPr>
+        <w:lastRenderedPageBreak/>
+        <w:t xml:space="preserve">changer les fonctionnalités. Enfin, la version 3 a introduit une vraie architecture objet : </w:t>
+      </w:r>
+      <w:proofErr w:type="spellStart"/>
+      <w:r>
+        <w:rPr>
+          <w:lang w:val="fr-FR"/>
+        </w:rPr>
+        <w:t>AuthentificationManager</w:t>
+      </w:r>
+      <w:proofErr w:type="spellEnd"/>
+      <w:r>
+        <w:rPr>
+          <w:lang w:val="fr-FR"/>
+        </w:rPr>
+        <w:t xml:space="preserve"> gère la validation de la carte (16 chiffres) et du PIN (6 chiffres), </w:t>
+      </w:r>
+      <w:proofErr w:type="spellStart"/>
+      <w:r>
+        <w:rPr>
+          <w:lang w:val="fr-FR"/>
+        </w:rPr>
+        <w:t>ClassicTransaction</w:t>
+      </w:r>
+      <w:proofErr w:type="spellEnd"/>
+      <w:r>
+        <w:rPr>
+          <w:lang w:val="fr-FR"/>
+        </w:rPr>
+        <w:t xml:space="preserve"> encapsule le solde et l’historique des retraits dans un tableau dynamique (</w:t>
+      </w:r>
+      <w:proofErr w:type="spellStart"/>
+      <w:r>
+        <w:rPr>
+          <w:lang w:val="fr-FR"/>
+        </w:rPr>
+        <w:t>tabDraw</w:t>
+      </w:r>
+      <w:proofErr w:type="spellEnd"/>
+      <w:r>
+        <w:rPr>
+          <w:lang w:val="fr-FR"/>
+        </w:rPr>
+        <w:t xml:space="preserve">), et </w:t>
+      </w:r>
+      <w:proofErr w:type="spellStart"/>
+      <w:r>
+        <w:rPr>
+          <w:lang w:val="fr-FR"/>
+        </w:rPr>
+        <w:t>TransactionVIP</w:t>
+      </w:r>
+      <w:proofErr w:type="spellEnd"/>
+      <w:r>
+        <w:rPr>
+          <w:lang w:val="fr-FR"/>
+        </w:rPr>
+        <w:t xml:space="preserve"> hérite de </w:t>
+      </w:r>
+      <w:proofErr w:type="spellStart"/>
+      <w:r>
+        <w:rPr>
+          <w:lang w:val="fr-FR"/>
+        </w:rPr>
+        <w:t>ClassicTransaction</w:t>
+      </w:r>
+      <w:proofErr w:type="spellEnd"/>
+      <w:r>
+        <w:rPr>
+          <w:lang w:val="fr-FR"/>
+        </w:rPr>
+        <w:t xml:space="preserve"> en surchargeant </w:t>
+      </w:r>
+      <w:proofErr w:type="spellStart"/>
+      <w:proofErr w:type="gramStart"/>
+      <w:r>
+        <w:rPr>
+          <w:lang w:val="fr-FR"/>
+        </w:rPr>
+        <w:t>withDraw</w:t>
+      </w:r>
+      <w:proofErr w:type="spellEnd"/>
+      <w:r>
+        <w:rPr>
+          <w:lang w:val="fr-FR"/>
+        </w:rPr>
+        <w:t>(</w:t>
+      </w:r>
+      <w:proofErr w:type="gramEnd"/>
+      <w:r>
+        <w:rPr>
+          <w:lang w:val="fr-FR"/>
+        </w:rPr>
+        <w:t>) pour proposer un comportement VIP déclenché automatiquement par la carte numéro 7777777777777777. Ce changement de paradigme rend le code beaucoup plus extensible : ajouter un nouveau type de compte ne nécessite que la création d’une nouvelle classe fille.</w:t>
+      </w:r>
+    </w:p>
+    <w:p>
+      <w:pPr>
+        <w:pStyle w:val="Titre2"/>
+        <w:rPr>
+          <w:lang w:val="fr-FR"/>
+        </w:rPr>
+      </w:pPr>
+      <w:bookmarkStart w:id="10" w:name="_Toc_Conclusion"/>
+      <w:bookmarkStart w:id="11" w:name="_Toc224302954"/>
+      <w:r>
+        <w:rPr>
+          <w:lang w:val="fr-FR"/>
+        </w:rPr>
+        <w:t>Conclusion</w:t>
+      </w:r>
+      <w:bookmarkEnd w:id="10"/>
+      <w:bookmarkEnd w:id="11"/>
+    </w:p>
+    <w:p>
+      <w:pPr>
+        <w:rPr>
+          <w:lang w:val="fr-FR"/>
+        </w:rPr>
+      </w:pPr>
+      <w:r>
+        <w:rPr>
+          <w:lang w:val="fr-FR"/>
+        </w:rPr>
+        <w:t>Ce projet m’a permis de découvrir et de comprendre en profondeur les avantages de la programmation orientée objet. En partant d’une approche procédurale simple, puis en passant par une organisation modulaire, pour finalement aboutir à une architecture orientée objet complète, j’ai pu observer concrètement comment la structure du code évolue et s’améliore à chaque étape.</w:t>
+      </w:r>
+    </w:p>
+    <w:p>
+      <w:pPr>
+        <w:rPr>
+          <w:lang w:val="fr-FR"/>
+        </w:rPr>
+      </w:pPr>
+      <w:r>
+        <w:rPr>
+          <w:lang w:val="fr-FR"/>
+        </w:rPr>
+        <w:t>Le choix du bancomat comme domaine d’application s’est révélé particulièrement adapté à cet exercice. Les entités naturelles du système (compte, transaction, carte, bancomat) se prêtent très bien à la modélisation orientée objet, et les concepts d’encapsulation ou d’héritage y prennent tout leur sens. Ce projet m’a également appris à mieux organiser mon travail grâce à Git, à documenter mon code et à respecter des conventions de nommage rigoureuses.</w:t>
+      </w:r>
+    </w:p>
+    <w:p>
+      <w:pPr>
+        <w:rPr>
+          <w:lang w:val="fr-FR"/>
+        </w:rPr>
+      </w:pPr>
+      <w:r>
+        <w:rPr>
+          <w:lang w:val="fr-FR"/>
+        </w:rPr>
+        <w:t xml:space="preserve">En conclusion, ce projet « OO </w:t>
+      </w:r>
+      <w:proofErr w:type="spellStart"/>
+      <w:r>
+        <w:rPr>
+          <w:lang w:val="fr-FR"/>
+        </w:rPr>
+        <w:t>Them</w:t>
+      </w:r>
+      <w:proofErr w:type="spellEnd"/>
+      <w:r>
+        <w:rPr>
+          <w:lang w:val="fr-FR"/>
+        </w:rPr>
+        <w:t xml:space="preserve"> All » a été une expérience d’apprentissage enrichissante qui m’a donné les bases solides pour aborder des projets logiciels plus complexes avec une approche orientée objet.</w:t>
+      </w:r>
+    </w:p>
+    <w:p>
+      <w:pPr>
+        <w:pStyle w:val="Titre2"/>
+        <w:rPr>
+          <w:lang w:val="fr-FR"/>
+        </w:rPr>
+      </w:pPr>
     </w:p>
     <w:sectPr>
       <w:pgSz w:w="11906" w:h="16838"/>
@@ -637,6 +1840,54 @@
     </w:p>
   </w:endnote>
 </w:endnotes>
+</file>
+
+<file path=word/footer1.xml><?xml version="1.0" encoding="utf-8"?>
+<w:ftr xmlns:wpc="http://schemas.microsoft.com/office/word/2010/wordprocessingCanvas" xmlns:cx="http://schemas.microsoft.com/office/drawing/2014/chartex" xmlns:cx1="http://schemas.microsoft.com/office/drawing/2015/9/8/chartex" xmlns:cx2="http://schemas.microsoft.com/office/drawing/2015/10/21/chartex" xmlns:cx3="http://schemas.microsoft.com/office/drawing/2016/5/9/chartex" xmlns:cx4="http://schemas.microsoft.com/office/drawing/2016/5/10/chartex" xmlns:cx5="http://schemas.microsoft.com/office/drawing/2016/5/11/chartex" xmlns:cx6="http://schemas.microsoft.com/office/drawing/2016/5/12/chartex" xmlns:cx7="http://schemas.microsoft.com/office/drawing/2016/5/13/chartex" xmlns:cx8="http://schemas.microsoft.com/office/drawing/2016/5/14/chartex" xmlns:mc="http://schemas.openxmlformats.org/markup-compatibility/2006" xmlns:aink="http://schemas.microsoft.com/office/drawing/2016/ink" xmlns:am3d="http://schemas.microsoft.com/office/drawing/2017/model3d" xmlns:o="urn:schemas-microsoft-com:office:office" xmlns:oel="http://schemas.microsoft.com/office/2019/extlst" xmlns:r="http://schemas.openxmlformats.org/officeDocument/2006/relationships" xmlns:m="http://schemas.openxmlformats.org/officeDocument/2006/math" xmlns:v="urn:schemas-microsoft-com:vml" xmlns:wp14="http://schemas.microsoft.com/office/word/2010/wordprocessingDrawing" xmlns:wp="http://schemas.openxmlformats.org/drawingml/2006/wordprocessingDrawing" xmlns:w10="urn:schemas-microsoft-com:office:word" xmlns:w="http://schemas.openxmlformats.org/wordprocessingml/2006/main" xmlns:w14="http://schemas.microsoft.com/office/word/2010/wordml" xmlns:w15="http://schemas.microsoft.com/office/word/2012/wordml" xmlns:w16cex="http://schemas.microsoft.com/office/word/2018/wordml/cex" xmlns:w16cid="http://schemas.microsoft.com/office/word/2016/wordml/cid" xmlns:w16="http://schemas.microsoft.com/office/word/2018/wordml" xmlns:w16sdtdh="http://schemas.microsoft.com/office/word/2020/wordml/sdtdatahash" xmlns:w16se="http://schemas.microsoft.com/office/word/2015/wordml/symex" xmlns:wpg="http://schemas.microsoft.com/office/word/2010/wordprocessingGroup" xmlns:wpi="http://schemas.microsoft.com/office/word/2010/wordprocessingInk" xmlns:wne="http://schemas.microsoft.com/office/word/2006/wordml" xmlns:wps="http://schemas.microsoft.com/office/word/2010/wordprocessingShape" mc:Ignorable="w14 w15 w16se w16cid w16 w16cex w16sdtdh wp14">
+  <w:sdt>
+    <w:sdtPr>
+      <w:id w:val="1056051480"/>
+      <w:docPartObj>
+        <w:docPartGallery w:val="Page Numbers (Bottom of Page)"/>
+        <w:docPartUnique/>
+      </w:docPartObj>
+    </w:sdtPr>
+    <w:sdtContent>
+      <w:p>
+        <w:pPr>
+          <w:pStyle w:val="Pieddepage"/>
+          <w:jc w:val="right"/>
+        </w:pPr>
+        <w:r>
+          <w:fldChar w:fldCharType="begin"/>
+        </w:r>
+        <w:r>
+          <w:instrText>PAGE   \* MERGEFORMAT</w:instrText>
+        </w:r>
+        <w:r>
+          <w:fldChar w:fldCharType="separate"/>
+        </w:r>
+        <w:r>
+          <w:rPr>
+            <w:lang w:val="fr-FR"/>
+          </w:rPr>
+          <w:t>2</w:t>
+        </w:r>
+        <w:r>
+          <w:fldChar w:fldCharType="end"/>
+        </w:r>
+      </w:p>
+    </w:sdtContent>
+  </w:sdt>
+  <w:p>
+    <w:pPr>
+      <w:pStyle w:val="Pieddepage"/>
+    </w:pPr>
+    <w:r>
+      <w:t>Rayan Sahbani</w:t>
+    </w:r>
+  </w:p>
+</w:ftr>
 </file>
 
 <file path=word/footnotes.xml><?xml version="1.0" encoding="utf-8"?>
@@ -1417,6 +2668,10 @@
   <w:style w:type="paragraph" w:default="1" w:styleId="Normal">
     <w:name w:val="Normal"/>
     <w:qFormat/>
+    <w:rsid w:val="00167339"/>
+    <w:rPr>
+      <w:rFonts w:ascii="Arial" w:hAnsi="Arial"/>
+    </w:rPr>
   </w:style>
   <w:style w:type="paragraph" w:styleId="Titre1">
     <w:name w:val="heading 1"/>
@@ -1433,7 +2688,7 @@
       <w:outlineLvl w:val="0"/>
     </w:pPr>
     <w:rPr>
-      <w:rFonts w:ascii="Arial" w:eastAsiaTheme="majorEastAsia" w:hAnsi="Arial" w:cstheme="majorBidi"/>
+      <w:rFonts w:eastAsiaTheme="majorEastAsia" w:cstheme="majorBidi"/>
       <w:color w:val="0F4761" w:themeColor="accent1" w:themeShade="BF"/>
       <w:sz w:val="56"/>
       <w:szCs w:val="40"/>

</xml_diff>